<commit_message>
updated hods and other officers images and names
</commit_message>
<xml_diff>
--- a/public/image/APAPA COUNCIL PHOTOS_/Council portfolio Name list_.docx
+++ b/public/image/APAPA COUNCIL PHOTOS_/Council portfolio Name list_.docx
@@ -41,7 +41,7 @@
           <w:pgNumType w:start="1"/>
         </w:sectPr>
       </w:pPr>
-      <w:bookmarkStart w:colFirst="0" w:colLast="0" w:name="_l86fpnkwom15" w:id="0"/>
+      <w:bookmarkStart w:colFirst="0" w:colLast="0" w:name="_mjlqetfqvn8r" w:id="0"/>
       <w:bookmarkEnd w:id="0"/>
       <w:r>
         <w:rPr>
@@ -165,7 +165,7 @@
           <w:pgNumType w:start="1"/>
         </w:sectPr>
       </w:pPr>
-      <w:bookmarkStart w:colFirst="0" w:colLast="0" w:name="_tz5r2i2p8l7h" w:id="1"/>
+      <w:bookmarkStart w:colFirst="0" w:colLast="0" w:name="_xfnzq3m8mfer" w:id="1"/>
       <w:bookmarkEnd w:id="1"/>
       <w:r>
         <w:rPr>
@@ -319,7 +319,7 @@
           <w:pgNumType w:start="1"/>
         </w:sectPr>
       </w:pPr>
-      <w:bookmarkStart w:colFirst="0" w:colLast="0" w:name="_hn1wpf2m4drt" w:id="2"/>
+      <w:bookmarkStart w:colFirst="0" w:colLast="0" w:name="_l7syhikxnwti" w:id="2"/>
       <w:bookmarkEnd w:id="2"/>
       <w:r>
         <w:rPr>
@@ -422,7 +422,7 @@
         <w:rPr>
           <w:rtl w:val="0"/>
         </w:rPr>
-        <w:t xml:space="preserve">NO 13: Miss. Bukunmi Akugbe Aluko (Special Adviser Intergovernmental relations) </w:t>
+        <w:t xml:space="preserve">NO 13: Miss. Ibukunmi Akugbe Aluko (Special Adviser Intergovernmental relations) </w:t>
       </w:r>
     </w:p>
     <w:p>
@@ -459,9 +459,9 @@
         <w:rPr>
           <w:rtl w:val="0"/>
         </w:rPr>
-        <w:t xml:space="preserve">NO 18: Mr Samuel Olawale Tairu [Special Adviser Health]</w:t>
+        <w:t xml:space="preserve">NO 18: Prince Adeyinka Yusuf Aromire [Special Adviser Youth and Sport] </w:t>
         <w:br w:type="textWrapping"/>
-        <w:t xml:space="preserve">NO 19: Prince Adeyinka Yusuf Aromire [Special Adviser Youth and Sport]</w:t>
+        <w:t xml:space="preserve">NO 19: Mr Samuel Olawale Tairu [Special Adviser Health]</w:t>
         <w:br w:type="textWrapping"/>
       </w:r>
     </w:p>
@@ -517,7 +517,7 @@
           <w:pgNumType w:start="1"/>
         </w:sectPr>
       </w:pPr>
-      <w:bookmarkStart w:colFirst="0" w:colLast="0" w:name="_65wydny3vie2" w:id="3"/>
+      <w:bookmarkStart w:colFirst="0" w:colLast="0" w:name="_yaj5psfht7oz" w:id="3"/>
       <w:bookmarkEnd w:id="3"/>
       <w:r>
         <w:rPr>
@@ -558,6 +558,76 @@
     <w:p>
       <w:pPr>
         <w:rPr/>
+      </w:pPr>
+      <w:r>
+        <w:rPr>
+          <w:rtl w:val="0"/>
+        </w:rPr>
+        <w:t xml:space="preserve">N:Aminu Saidu [Social Media]</w:t>
+        <w:br w:type="textWrapping"/>
+        <w:t xml:space="preserve">B:Rainbow Aishat Hannah (Special Assistant Intergovernmental Relations)</w:t>
+        <w:br w:type="textWrapping"/>
+        <w:t xml:space="preserve">C:Aghamba Ngozi Jessica (Special Assistant Education &amp; Youth)</w:t>
+      </w:r>
+    </w:p>
+    <w:p>
+      <w:pPr>
+        <w:rPr/>
+      </w:pPr>
+      <w:r>
+        <w:rPr>
+          <w:rtl w:val="0"/>
+        </w:rPr>
+        <w:t xml:space="preserve">V: Gbokoyi Oluwaseun (Senior Special Assistant Media)</w:t>
+      </w:r>
+    </w:p>
+    <w:p>
+      <w:pPr>
+        <w:rPr/>
+      </w:pPr>
+      <w:r>
+        <w:rPr>
+          <w:rtl w:val="0"/>
+        </w:rPr>
+        <w:t xml:space="preserve">T: Kelvin Okereke (Senior Special Assistant Environment) </w:t>
+      </w:r>
+    </w:p>
+    <w:p>
+      <w:pPr>
+        <w:rPr/>
+      </w:pPr>
+      <w:r>
+        <w:rPr>
+          <w:rtl w:val="0"/>
+        </w:rPr>
+        <w:t xml:space="preserve">O: Oke Solomon ( Special Assistant Photography) </w:t>
+      </w:r>
+    </w:p>
+    <w:p>
+      <w:pPr>
+        <w:rPr/>
+      </w:pPr>
+      <w:r>
+        <w:rPr>
+          <w:rtl w:val="0"/>
+        </w:rPr>
+        <w:t xml:space="preserve">J: Daud Shuarau (Senior Special Assistant Special Duties) </w:t>
+      </w:r>
+    </w:p>
+    <w:p>
+      <w:pPr>
+        <w:rPr/>
+      </w:pPr>
+      <w:r>
+        <w:rPr>
+          <w:rtl w:val="0"/>
+        </w:rPr>
+        <w:t xml:space="preserve">G: Sam Idoko (Senior Special Assistant Youth &amp; Sports) </w:t>
+      </w:r>
+    </w:p>
+    <w:p>
+      <w:pPr>
+        <w:rPr/>
         <w:sectPr>
           <w:type w:val="nextPage"/>
           <w:pgSz w:h="15840" w:w="12240" w:orient="portrait"/>
@@ -569,11 +639,7 @@
         <w:rPr>
           <w:rtl w:val="0"/>
         </w:rPr>
-        <w:t xml:space="preserve">A:Aminu [Social Media]</w:t>
-        <w:br w:type="textWrapping"/>
-        <w:t xml:space="preserve">B: Rainbow Aishat Hannah (Special Assistant Intergovernmental Relations)</w:t>
-        <w:br w:type="textWrapping"/>
-        <w:t xml:space="preserve">C: Aghamba Ngozi Jessica (Special Assistant Education &amp; Youth)</w:t>
+        <w:t xml:space="preserve">R: Daodu Augustine (Senior Special Assistant Political)</w:t>
       </w:r>
     </w:p>
     <w:p>
@@ -602,7 +668,7 @@
           <w:pgNumType w:start="1"/>
         </w:sectPr>
       </w:pPr>
-      <w:bookmarkStart w:colFirst="0" w:colLast="0" w:name="_q88rxzw3e5sp" w:id="4"/>
+      <w:bookmarkStart w:colFirst="0" w:colLast="0" w:name="_dgb67j3idhhy" w:id="4"/>
       <w:bookmarkEnd w:id="4"/>
       <w:r>
         <w:rPr>
@@ -641,6 +707,36 @@
         <w:rPr>
           <w:rtl w:val="0"/>
         </w:rPr>
+        <w:t xml:space="preserve">Mrs Okunade Oluwakemi - HOU WAPA</w:t>
+      </w:r>
+    </w:p>
+    <w:p>
+      <w:pPr>
+        <w:numPr>
+          <w:ilvl w:val="0"/>
+          <w:numId w:val="2"/>
+        </w:numPr>
+        <w:ind w:left="720" w:hanging="360"/>
+      </w:pPr>
+      <w:r>
+        <w:rPr>
+          <w:rtl w:val="0"/>
+        </w:rPr>
+        <w:t xml:space="preserve">Mr Kadiri - Procurement Officer </w:t>
+      </w:r>
+    </w:p>
+    <w:p>
+      <w:pPr>
+        <w:numPr>
+          <w:ilvl w:val="0"/>
+          <w:numId w:val="2"/>
+        </w:numPr>
+        <w:ind w:left="720" w:hanging="360"/>
+      </w:pPr>
+      <w:r>
+        <w:rPr>
+          <w:rtl w:val="0"/>
+        </w:rPr>
         <w:t xml:space="preserve">Mrs. Akinlehin E. Olajumoke - HOD Budget </w:t>
       </w:r>
     </w:p>
@@ -656,6 +752,21 @@
         <w:rPr>
           <w:rtl w:val="0"/>
         </w:rPr>
+        <w:t xml:space="preserve">Mrs. Dally Modupe M. - HOD Education </w:t>
+      </w:r>
+    </w:p>
+    <w:p>
+      <w:pPr>
+        <w:numPr>
+          <w:ilvl w:val="0"/>
+          <w:numId w:val="2"/>
+        </w:numPr>
+        <w:ind w:left="720" w:hanging="360"/>
+      </w:pPr>
+      <w:r>
+        <w:rPr>
+          <w:rtl w:val="0"/>
+        </w:rPr>
         <w:t xml:space="preserve">Mrs. Onibon Kafayat - Council Treasurer</w:t>
       </w:r>
     </w:p>
@@ -687,6 +798,132 @@
           <w:rtl w:val="0"/>
         </w:rPr>
         <w:t xml:space="preserve">Mrs. Alogba Olabisi O.- HOU Tourism  </w:t>
+      </w:r>
+    </w:p>
+    <w:p>
+      <w:pPr>
+        <w:numPr>
+          <w:ilvl w:val="0"/>
+          <w:numId w:val="2"/>
+        </w:numPr>
+        <w:ind w:left="720" w:hanging="360"/>
+      </w:pPr>
+      <w:r>
+        <w:rPr>
+          <w:rtl w:val="0"/>
+        </w:rPr>
+        <w:t xml:space="preserve">Mrs. Oyebiyi Oyekemi O - Public Affairs Officer/ Information </w:t>
+      </w:r>
+    </w:p>
+    <w:p>
+      <w:pPr>
+        <w:numPr>
+          <w:ilvl w:val="0"/>
+          <w:numId w:val="2"/>
+        </w:numPr>
+        <w:ind w:left="720" w:hanging="360"/>
+      </w:pPr>
+      <w:r>
+        <w:rPr>
+          <w:rtl w:val="0"/>
+        </w:rPr>
+        <w:t xml:space="preserve">Mr Akinola Moshood Olalekan- HOD Agric and Social Services </w:t>
+      </w:r>
+    </w:p>
+    <w:p>
+      <w:pPr>
+        <w:numPr>
+          <w:ilvl w:val="0"/>
+          <w:numId w:val="2"/>
+        </w:numPr>
+        <w:ind w:left="720" w:hanging="360"/>
+      </w:pPr>
+      <w:r>
+        <w:rPr>
+          <w:rtl w:val="0"/>
+        </w:rPr>
+        <w:t xml:space="preserve">Mr Obikoya Babatunde - HOD Environment </w:t>
+      </w:r>
+    </w:p>
+    <w:p>
+      <w:pPr>
+        <w:numPr>
+          <w:ilvl w:val="0"/>
+          <w:numId w:val="2"/>
+        </w:numPr>
+        <w:ind w:left="720" w:hanging="360"/>
+      </w:pPr>
+      <w:r>
+        <w:rPr>
+          <w:rtl w:val="0"/>
+        </w:rPr>
+        <w:t xml:space="preserve">Mr. Shaodara Temidayo Jamiu - HOD ICT </w:t>
+      </w:r>
+    </w:p>
+    <w:p>
+      <w:pPr>
+        <w:numPr>
+          <w:ilvl w:val="0"/>
+          <w:numId w:val="2"/>
+        </w:numPr>
+        <w:ind w:left="720" w:hanging="360"/>
+      </w:pPr>
+      <w:r>
+        <w:rPr>
+          <w:rtl w:val="0"/>
+        </w:rPr>
+        <w:t xml:space="preserve">Engr. Damilola Oyegbami- Council Engineer </w:t>
+      </w:r>
+    </w:p>
+    <w:p>
+      <w:pPr>
+        <w:numPr>
+          <w:ilvl w:val="0"/>
+          <w:numId w:val="2"/>
+        </w:numPr>
+        <w:ind w:left="720" w:hanging="360"/>
+      </w:pPr>
+      <w:r>
+        <w:rPr>
+          <w:rtl w:val="0"/>
+        </w:rPr>
+        <w:t xml:space="preserve">Mrs. Adedeji Kemisola L. - Human Resource Officer </w:t>
+      </w:r>
+    </w:p>
+    <w:p>
+      <w:pPr>
+        <w:numPr>
+          <w:ilvl w:val="0"/>
+          <w:numId w:val="2"/>
+        </w:numPr>
+        <w:ind w:left="720" w:hanging="360"/>
+      </w:pPr>
+      <w:r>
+        <w:rPr>
+          <w:rtl w:val="0"/>
+        </w:rPr>
+        <w:t xml:space="preserve">Mr. Preston Babajide- Internal Auditor </w:t>
+      </w:r>
+    </w:p>
+    <w:p>
+      <w:pPr>
+        <w:rPr/>
+      </w:pPr>
+      <w:r>
+        <w:rPr>
+          <w:rtl w:val="0"/>
+        </w:rPr>
+      </w:r>
+    </w:p>
+    <w:p>
+      <w:pPr>
+        <w:rPr/>
+      </w:pPr>
+      <w:r>
+        <w:rPr>
+          <w:rtl w:val="0"/>
+        </w:rPr>
+        <w:t xml:space="preserve">HOD/HOU (HEAD OF DEPARTMENT/HEAD OF UNIT) </w:t>
       </w:r>
     </w:p>
     <w:sectPr>
@@ -814,21 +1051,21 @@
   <w:abstractNum w:abstractNumId="2">
     <w:lvl w:ilvl="0">
       <w:start w:val="1"/>
-      <w:numFmt w:val="upperRoman"/>
+      <w:numFmt w:val="lowerLetter"/>
       <w:lvlText w:val="%1."/>
+      <w:lvlJc w:val="left"/>
+      <w:pPr>
+        <w:ind w:left="720" w:hanging="360"/>
+      </w:pPr>
+      <w:rPr>
+        <w:u w:val="none"/>
+      </w:rPr>
+    </w:lvl>
+    <w:lvl w:ilvl="1">
+      <w:start w:val="1"/>
+      <w:numFmt w:val="lowerRoman"/>
+      <w:lvlText w:val="%2."/>
       <w:lvlJc w:val="right"/>
-      <w:pPr>
-        <w:ind w:left="720" w:hanging="360"/>
-      </w:pPr>
-      <w:rPr>
-        <w:u w:val="none"/>
-      </w:rPr>
-    </w:lvl>
-    <w:lvl w:ilvl="1">
-      <w:start w:val="1"/>
-      <w:numFmt w:val="upperLetter"/>
-      <w:lvlText w:val="%2."/>
-      <w:lvlJc w:val="left"/>
       <w:pPr>
         <w:ind w:left="1440" w:hanging="360"/>
       </w:pPr>
@@ -851,7 +1088,7 @@
     <w:lvl w:ilvl="3">
       <w:start w:val="1"/>
       <w:numFmt w:val="lowerLetter"/>
-      <w:lvlText w:val="%4)"/>
+      <w:lvlText w:val="%4."/>
       <w:lvlJc w:val="left"/>
       <w:pPr>
         <w:ind w:left="2880" w:hanging="360"/>
@@ -862,57 +1099,57 @@
     </w:lvl>
     <w:lvl w:ilvl="4">
       <w:start w:val="1"/>
+      <w:numFmt w:val="lowerRoman"/>
+      <w:lvlText w:val="%5."/>
+      <w:lvlJc w:val="right"/>
+      <w:pPr>
+        <w:ind w:left="3600" w:hanging="360"/>
+      </w:pPr>
+      <w:rPr>
+        <w:u w:val="none"/>
+      </w:rPr>
+    </w:lvl>
+    <w:lvl w:ilvl="5">
+      <w:start w:val="1"/>
       <w:numFmt w:val="decimal"/>
-      <w:lvlText w:val="(%5)"/>
+      <w:lvlText w:val="%6."/>
       <w:lvlJc w:val="left"/>
       <w:pPr>
-        <w:ind w:left="3600" w:hanging="360"/>
-      </w:pPr>
-      <w:rPr>
-        <w:u w:val="none"/>
-      </w:rPr>
-    </w:lvl>
-    <w:lvl w:ilvl="5">
+        <w:ind w:left="4320" w:hanging="360"/>
+      </w:pPr>
+      <w:rPr>
+        <w:u w:val="none"/>
+      </w:rPr>
+    </w:lvl>
+    <w:lvl w:ilvl="6">
       <w:start w:val="1"/>
       <w:numFmt w:val="lowerLetter"/>
-      <w:lvlText w:val="(%6)"/>
+      <w:lvlText w:val="%7."/>
       <w:lvlJc w:val="left"/>
       <w:pPr>
-        <w:ind w:left="4320" w:hanging="360"/>
-      </w:pPr>
-      <w:rPr>
-        <w:u w:val="none"/>
-      </w:rPr>
-    </w:lvl>
-    <w:lvl w:ilvl="6">
+        <w:ind w:left="5040" w:hanging="360"/>
+      </w:pPr>
+      <w:rPr>
+        <w:u w:val="none"/>
+      </w:rPr>
+    </w:lvl>
+    <w:lvl w:ilvl="7">
       <w:start w:val="1"/>
       <w:numFmt w:val="lowerRoman"/>
-      <w:lvlText w:val="(%7)"/>
+      <w:lvlText w:val="%8."/>
       <w:lvlJc w:val="right"/>
       <w:pPr>
-        <w:ind w:left="5040" w:hanging="360"/>
-      </w:pPr>
-      <w:rPr>
-        <w:u w:val="none"/>
-      </w:rPr>
-    </w:lvl>
-    <w:lvl w:ilvl="7">
-      <w:start w:val="1"/>
-      <w:numFmt w:val="lowerLetter"/>
-      <w:lvlText w:val="(%8)"/>
+        <w:ind w:left="5760" w:hanging="360"/>
+      </w:pPr>
+      <w:rPr>
+        <w:u w:val="none"/>
+      </w:rPr>
+    </w:lvl>
+    <w:lvl w:ilvl="8">
+      <w:start w:val="1"/>
+      <w:numFmt w:val="decimal"/>
+      <w:lvlText w:val="%9."/>
       <w:lvlJc w:val="left"/>
-      <w:pPr>
-        <w:ind w:left="5760" w:hanging="360"/>
-      </w:pPr>
-      <w:rPr>
-        <w:u w:val="none"/>
-      </w:rPr>
-    </w:lvl>
-    <w:lvl w:ilvl="8">
-      <w:start w:val="1"/>
-      <w:numFmt w:val="lowerRoman"/>
-      <w:lvlText w:val="(%9)"/>
-      <w:lvlJc w:val="right"/>
       <w:pPr>
         <w:ind w:left="6480" w:hanging="360"/>
       </w:pPr>

</xml_diff>

<commit_message>
Update on the Organogram Secretary and Special Advisers)
</commit_message>
<xml_diff>
--- a/public/image/APAPA COUNCIL PHOTOS_/Council portfolio Name list_.docx
+++ b/public/image/APAPA COUNCIL PHOTOS_/Council portfolio Name list_.docx
@@ -41,7 +41,7 @@
           <w:pgNumType w:start="1"/>
         </w:sectPr>
       </w:pPr>
-      <w:bookmarkStart w:colFirst="0" w:colLast="0" w:name="_7gcelgpox234" w:id="0"/>
+      <w:bookmarkStart w:colFirst="0" w:colLast="0" w:name="_c22dheepictd" w:id="0"/>
       <w:bookmarkEnd w:id="0"/>
       <w:r>
         <w:rPr>
@@ -165,7 +165,7 @@
           <w:pgNumType w:start="1"/>
         </w:sectPr>
       </w:pPr>
-      <w:bookmarkStart w:colFirst="0" w:colLast="0" w:name="_lhrdhqhf2zc8" w:id="1"/>
+      <w:bookmarkStart w:colFirst="0" w:colLast="0" w:name="_hxfva7fvs4r2" w:id="1"/>
       <w:bookmarkEnd w:id="1"/>
       <w:r>
         <w:rPr>
@@ -319,7 +319,7 @@
           <w:pgNumType w:start="1"/>
         </w:sectPr>
       </w:pPr>
-      <w:bookmarkStart w:colFirst="0" w:colLast="0" w:name="_7p7fjclf54l" w:id="2"/>
+      <w:bookmarkStart w:colFirst="0" w:colLast="0" w:name="_ggbi21xcdy1t" w:id="2"/>
       <w:bookmarkEnd w:id="2"/>
       <w:r>
         <w:rPr>
@@ -433,7 +433,7 @@
         <w:rPr>
           <w:rtl w:val="0"/>
         </w:rPr>
-        <w:t xml:space="preserve">NO 14: Mr. Ademola Yakub (Supervisor Agriculture &amp; Social Development) </w:t>
+        <w:t xml:space="preserve">NO 14: Mr. Ademola Yakubu (Supervisor Agriculture &amp; Social Development) </w:t>
       </w:r>
     </w:p>
     <w:p>
@@ -462,7 +462,35 @@
         <w:t xml:space="preserve">NO 18: Prince Adeyinka Yusuf Aromire [Special Adviser Youth and Sport] </w:t>
         <w:br w:type="textWrapping"/>
         <w:t xml:space="preserve">NO 19: Mr Samuel Olawale Tairu [Special Adviser Health]</w:t>
+      </w:r>
+    </w:p>
+    <w:p>
+      <w:pPr>
+        <w:rPr/>
+      </w:pPr>
+      <w:r>
+        <w:rPr>
+          <w:rtl w:val="0"/>
+        </w:rPr>
+        <w:t xml:space="preserve">20: Olasode Hammed O. Special Adviser, Market Development </w:t>
         <w:br w:type="textWrapping"/>
+        <w:t xml:space="preserve">21: Babatunde Taofeek (Special Adviser, City Care Wad A) </w:t>
+        <w:br w:type="textWrapping"/>
+        <w:t xml:space="preserve">22: Aromire O. Samson (Special Adviser, City Care Wad E)</w:t>
+        <w:br w:type="textWrapping"/>
+        <w:t xml:space="preserve">23: Sandra Ilawole (Special Adviser Elderly Affairs)</w:t>
+        <w:br w:type="textWrapping"/>
+        <w:t xml:space="preserve">24: Oniyitan Modupe Grace (Special Adviser Civic Engagement)</w:t>
+        <w:br w:type="textWrapping"/>
+        <w:t xml:space="preserve">25: Olayiwola Adekunle (Special Adviser, Community Affairs) </w:t>
+        <w:br w:type="textWrapping"/>
+        <w:t xml:space="preserve">26: Adesola Adesanya-Atiroko (Special Adviser, City Care Ward C)</w:t>
+        <w:br w:type="textWrapping"/>
+        <w:t xml:space="preserve">27: Olusanya Olufemi  (Special Adviser, City Care Ward D) </w:t>
+        <w:br w:type="textWrapping"/>
+        <w:t xml:space="preserve">28: Babalola Bankole Mogaji (Special Adviser, Boundary Matters) </w:t>
+        <w:br w:type="textWrapping"/>
+        <w:t xml:space="preserve">29: Arugba Michael (Special Adviser, City Care Ward B) </w:t>
       </w:r>
     </w:p>
     <w:p>
@@ -517,7 +545,7 @@
           <w:pgNumType w:start="1"/>
         </w:sectPr>
       </w:pPr>
-      <w:bookmarkStart w:colFirst="0" w:colLast="0" w:name="_aazt164ewxh6" w:id="3"/>
+      <w:bookmarkStart w:colFirst="0" w:colLast="0" w:name="_2oxlzfu86wi2" w:id="3"/>
       <w:bookmarkEnd w:id="3"/>
       <w:r>
         <w:rPr>
@@ -690,7 +718,7 @@
           <w:pgNumType w:start="1"/>
         </w:sectPr>
       </w:pPr>
-      <w:bookmarkStart w:colFirst="0" w:colLast="0" w:name="_bxkqixt1c0lv" w:id="4"/>
+      <w:bookmarkStart w:colFirst="0" w:colLast="0" w:name="_8acxcuhzue4y" w:id="4"/>
       <w:bookmarkEnd w:id="4"/>
       <w:r>
         <w:rPr>

</xml_diff>